<commit_message>
B2B: cuadro de las 4 capas de la alianza en pesos (convenio, Beca Empresa 3/ciclo al 45% a cuotas, beneficios de la empresa, tarifa corporativa)
</commit_message>
<xml_diff>
--- a/recursos/comercial/B2B/COMPARATIVO_BENEFICIO_ALIANZA.docx
+++ b/recursos/comercial/B2B/COMPARATIVO_BENEFICIO_ALIANZA.docx
@@ -9,7 +9,7 @@
           <w:color w:val="E54C09"/>
           <w:sz w:val="28"/>
         </w:rPr>
-        <w:t>QUÉ APORTA LA ALIANZA HEIIU BUSINESS PARTNER — programa completo A1 a B2, precio de lista $8.696.000</w:t>
+        <w:t>ALIANZA HEIIU BUSINESS PARTNER — LAS CUATRO CAPAS, EN PESOS</w:t>
       </w:r>
     </w:p>
     <w:p>
@@ -18,7 +18,7 @@
           <w:color w:val="777777"/>
           <w:sz w:val="19"/>
         </w:rPr>
-        <w:t>Porcentajes del Reglamento del Fondo de Becas (art. 3.3, 3.4 y 3.5). La empresa no paga nada.</w:t>
+        <w:t>Programa completo A1 a B2 · precio de lista $8.696.000 · porcentajes de la columna Transformación del Fondo (45% contado / 36% cuotas) y General (32% / 26%)</w:t>
       </w:r>
     </w:p>
     <w:tbl>
@@ -28,16 +28,19 @@
         <w:tblLook w:firstColumn="1" w:firstRow="1" w:lastColumn="0" w:lastRow="0" w:noHBand="0" w:noVBand="1" w:val="04A0"/>
       </w:tblPr>
       <w:tblGrid>
-        <w:gridCol w:w="2828"/>
-        <w:gridCol w:w="2828"/>
-        <w:gridCol w:w="2828"/>
-        <w:gridCol w:w="2828"/>
-        <w:gridCol w:w="2828"/>
+        <w:gridCol w:w="1796"/>
+        <w:gridCol w:w="1796"/>
+        <w:gridCol w:w="1796"/>
+        <w:gridCol w:w="1796"/>
+        <w:gridCol w:w="1796"/>
+        <w:gridCol w:w="1796"/>
+        <w:gridCol w:w="1796"/>
+        <w:gridCol w:w="1796"/>
       </w:tblGrid>
       <w:tr>
         <w:tc>
           <w:tcPr>
-            <w:tcW w:type="dxa" w:w="3685"/>
+            <w:tcW w:type="dxa" w:w="1474"/>
             <w:shd w:val="clear" w:color="auto" w:fill="FFF8E7"/>
           </w:tcPr>
           <w:p>
@@ -47,15 +50,14 @@
             <w:r>
               <w:rPr>
                 <w:b/>
-                <w:sz w:val="21"/>
+                <w:sz w:val="19"/>
               </w:rPr>
-              <w:t>Quién</w:t>
             </w:r>
           </w:p>
         </w:tc>
         <w:tc>
           <w:tcPr>
-            <w:tcW w:type="dxa" w:w="2268"/>
+            <w:tcW w:type="dxa" w:w="2041"/>
             <w:shd w:val="clear" w:color="auto" w:fill="FFF8E7"/>
           </w:tcPr>
           <w:p>
@@ -65,15 +67,15 @@
             <w:r>
               <w:rPr>
                 <w:b/>
-                <w:sz w:val="21"/>
+                <w:sz w:val="19"/>
               </w:rPr>
-              <w:t>Perfil que le aplica</w:t>
+              <w:t>QUIÉN</w:t>
             </w:r>
           </w:p>
         </w:tc>
         <w:tc>
           <w:tcPr>
-            <w:tcW w:type="dxa" w:w="2381"/>
+            <w:tcW w:type="dxa" w:w="2608"/>
             <w:shd w:val="clear" w:color="auto" w:fill="FFF8E7"/>
           </w:tcPr>
           <w:p>
@@ -83,15 +85,15 @@
             <w:r>
               <w:rPr>
                 <w:b/>
-                <w:sz w:val="21"/>
+                <w:sz w:val="19"/>
               </w:rPr>
-              <w:t>Paga de contado</w:t>
+              <w:t>QUÉ RECIBE</w:t>
             </w:r>
           </w:p>
         </w:tc>
         <w:tc>
           <w:tcPr>
-            <w:tcW w:type="dxa" w:w="2381"/>
+            <w:tcW w:type="dxa" w:w="1531"/>
             <w:shd w:val="clear" w:color="auto" w:fill="FFF8E7"/>
           </w:tcPr>
           <w:p>
@@ -101,15 +103,15 @@
             <w:r>
               <w:rPr>
                 <w:b/>
-                <w:sz w:val="21"/>
+                <w:sz w:val="19"/>
               </w:rPr>
-              <w:t>Paga a cuotas</w:t>
+              <w:t>PAGA DE CONTADO</w:t>
             </w:r>
           </w:p>
         </w:tc>
         <w:tc>
           <w:tcPr>
-            <w:tcW w:type="dxa" w:w="4309"/>
+            <w:tcW w:type="dxa" w:w="1531"/>
             <w:shd w:val="clear" w:color="auto" w:fill="FFF8E7"/>
           </w:tcPr>
           <w:p>
@@ -119,9 +121,63 @@
             <w:r>
               <w:rPr>
                 <w:b/>
-                <w:sz w:val="21"/>
+                <w:sz w:val="19"/>
               </w:rPr>
-              <w:t>Lo que la alianza le aporta</w:t>
+              <w:t>PAGA A CUOTAS</w:t>
+            </w:r>
+          </w:p>
+        </w:tc>
+        <w:tc>
+          <w:tcPr>
+            <w:tcW w:type="dxa" w:w="2494"/>
+            <w:shd w:val="clear" w:color="auto" w:fill="FFF8E7"/>
+          </w:tcPr>
+          <w:p>
+            <w:pPr>
+              <w:spacing w:after="0"/>
+            </w:pPr>
+            <w:r>
+              <w:rPr>
+                <w:b/>
+                <w:sz w:val="19"/>
+              </w:rPr>
+              <w:t>QUÉ GANA FRENTE A LLEGAR POR LA CALLE</w:t>
+            </w:r>
+          </w:p>
+        </w:tc>
+        <w:tc>
+          <w:tcPr>
+            <w:tcW w:type="dxa" w:w="1871"/>
+            <w:shd w:val="clear" w:color="auto" w:fill="FFF8E7"/>
+          </w:tcPr>
+          <w:p>
+            <w:pPr>
+              <w:spacing w:after="0"/>
+            </w:pPr>
+            <w:r>
+              <w:rPr>
+                <w:b/>
+                <w:sz w:val="19"/>
+              </w:rPr>
+              <w:t>LE CUESTA A HEIIU</w:t>
+            </w:r>
+          </w:p>
+        </w:tc>
+        <w:tc>
+          <w:tcPr>
+            <w:tcW w:type="dxa" w:w="1587"/>
+            <w:shd w:val="clear" w:color="auto" w:fill="FFF8E7"/>
+          </w:tcPr>
+          <w:p>
+            <w:pPr>
+              <w:spacing w:after="0"/>
+            </w:pPr>
+            <w:r>
+              <w:rPr>
+                <w:b/>
+                <w:sz w:val="19"/>
+              </w:rPr>
+              <w:t>QUIÉN CIERRA</w:t>
             </w:r>
           </w:p>
         </w:tc>
@@ -129,118 +185,7 @@
       <w:tr>
         <w:tc>
           <w:tcPr>
-            <w:tcW w:type="dxa" w:w="3685"/>
-          </w:tcPr>
-          <w:p>
-            <w:pPr>
-              <w:spacing w:after="0"/>
-            </w:pPr>
-            <w:r>
-              <w:rPr>
-                <w:sz w:val="21"/>
-              </w:rPr>
-              <w:t>Persona que llega por la calle</w:t>
-              <w:br/>
-              <w:t>(sin Cajasan, sin estrato 1-2)</w:t>
-            </w:r>
-          </w:p>
-        </w:tc>
-        <w:tc>
-          <w:tcPr>
-            <w:tcW w:type="dxa" w:w="2268"/>
-          </w:tcPr>
-          <w:p>
-            <w:pPr>
-              <w:spacing w:after="0"/>
-            </w:pPr>
-            <w:r>
-              <w:rPr>
-                <w:sz w:val="21"/>
-              </w:rPr>
-              <w:t>General</w:t>
-              <w:br/>
-              <w:t>(techo 32%)</w:t>
-            </w:r>
-          </w:p>
-        </w:tc>
-        <w:tc>
-          <w:tcPr>
-            <w:tcW w:type="dxa" w:w="2381"/>
-          </w:tcPr>
-          <w:p>
-            <w:pPr>
-              <w:spacing w:after="0"/>
-            </w:pPr>
-            <w:r>
-              <w:rPr>
-                <w:sz w:val="21"/>
-              </w:rPr>
-              <w:t>$5.913.280</w:t>
-              <w:br/>
-              <w:t>(32% de beca)</w:t>
-            </w:r>
-          </w:p>
-        </w:tc>
-        <w:tc>
-          <w:tcPr>
-            <w:tcW w:type="dxa" w:w="2381"/>
-          </w:tcPr>
-          <w:p>
-            <w:pPr>
-              <w:spacing w:after="0"/>
-            </w:pPr>
-            <w:r>
-              <w:rPr>
-                <w:sz w:val="21"/>
-              </w:rPr>
-              <w:t>$6.435.040</w:t>
-              <w:br/>
-              <w:t>(26% de beca)</w:t>
-            </w:r>
-          </w:p>
-        </w:tc>
-        <w:tc>
-          <w:tcPr>
-            <w:tcW w:type="dxa" w:w="4309"/>
-          </w:tcPr>
-          <w:p>
-            <w:pPr>
-              <w:spacing w:after="0"/>
-            </w:pPr>
-            <w:r>
-              <w:rPr>
-                <w:sz w:val="21"/>
-              </w:rPr>
-              <w:t>—</w:t>
-            </w:r>
-          </w:p>
-        </w:tc>
-      </w:tr>
-      <w:tr>
-        <w:tc>
-          <w:tcPr>
-            <w:tcW w:type="dxa" w:w="3685"/>
-            <w:shd w:val="clear" w:color="auto" w:fill="FFF3E8"/>
-          </w:tcPr>
-          <w:p>
-            <w:pPr>
-              <w:spacing w:after="0"/>
-            </w:pPr>
-            <w:r>
-              <w:rPr>
-                <w:sz w:val="21"/>
-              </w:rPr>
-              <w:t>Empleado de empresa aliada</w:t>
-              <w:br/>
-              <w:t>con ingresos hasta 1,5 SMMLV</w:t>
-              <w:br/>
-              <w:t>(carta de la empresa + desprendible)</w:t>
-            </w:r>
-          </w:p>
-        </w:tc>
-        <w:tc>
-          <w:tcPr>
-            <w:tcW w:type="dxa" w:w="2268"/>
+            <w:tcW w:type="dxa" w:w="1474"/>
             <w:shd w:val="clear" w:color="auto" w:fill="FFF3E8"/>
           </w:tcPr>
           <w:p>
@@ -250,17 +195,129 @@
             <w:r>
               <w:rPr>
                 <w:b/>
-                <w:sz w:val="21"/>
+                <w:sz w:val="19"/>
               </w:rPr>
-              <w:t>TRANSFORMACIÓN</w:t>
-              <w:br/>
-              <w:t>(techo 45%)</w:t>
+              <w:t>Referencia</w:t>
             </w:r>
           </w:p>
         </w:tc>
         <w:tc>
           <w:tcPr>
-            <w:tcW w:type="dxa" w:w="2381"/>
+            <w:tcW w:type="dxa" w:w="2041"/>
+          </w:tcPr>
+          <w:p>
+            <w:pPr>
+              <w:spacing w:after="0"/>
+            </w:pPr>
+            <w:r>
+              <w:rPr>
+                <w:sz w:val="19"/>
+              </w:rPr>
+              <w:t>Persona que llega por la calle (General, sin Cajasan)</w:t>
+            </w:r>
+          </w:p>
+        </w:tc>
+        <w:tc>
+          <w:tcPr>
+            <w:tcW w:type="dxa" w:w="2608"/>
+          </w:tcPr>
+          <w:p>
+            <w:pPr>
+              <w:spacing w:after="0"/>
+            </w:pPr>
+            <w:r>
+              <w:rPr>
+                <w:sz w:val="19"/>
+              </w:rPr>
+              <w:t>Beca General</w:t>
+            </w:r>
+          </w:p>
+        </w:tc>
+        <w:tc>
+          <w:tcPr>
+            <w:tcW w:type="dxa" w:w="1531"/>
+          </w:tcPr>
+          <w:p>
+            <w:pPr>
+              <w:spacing w:after="0"/>
+            </w:pPr>
+            <w:r>
+              <w:rPr>
+                <w:sz w:val="19"/>
+              </w:rPr>
+              <w:t>$5.913.280</w:t>
+            </w:r>
+          </w:p>
+        </w:tc>
+        <w:tc>
+          <w:tcPr>
+            <w:tcW w:type="dxa" w:w="1531"/>
+          </w:tcPr>
+          <w:p>
+            <w:pPr>
+              <w:spacing w:after="0"/>
+            </w:pPr>
+            <w:r>
+              <w:rPr>
+                <w:sz w:val="19"/>
+              </w:rPr>
+              <w:t>$6.435.040</w:t>
+            </w:r>
+          </w:p>
+        </w:tc>
+        <w:tc>
+          <w:tcPr>
+            <w:tcW w:type="dxa" w:w="2494"/>
+          </w:tcPr>
+          <w:p>
+            <w:pPr>
+              <w:spacing w:after="0"/>
+            </w:pPr>
+            <w:r>
+              <w:rPr>
+                <w:sz w:val="19"/>
+              </w:rPr>
+              <w:t>—</w:t>
+            </w:r>
+          </w:p>
+        </w:tc>
+        <w:tc>
+          <w:tcPr>
+            <w:tcW w:type="dxa" w:w="1871"/>
+          </w:tcPr>
+          <w:p>
+            <w:pPr>
+              <w:spacing w:after="0"/>
+            </w:pPr>
+            <w:r>
+              <w:rPr>
+                <w:sz w:val="19"/>
+              </w:rPr>
+              <w:t>Lo normal del Fondo</w:t>
+            </w:r>
+          </w:p>
+        </w:tc>
+        <w:tc>
+          <w:tcPr>
+            <w:tcW w:type="dxa" w:w="1587"/>
+          </w:tcPr>
+          <w:p>
+            <w:pPr>
+              <w:spacing w:after="0"/>
+            </w:pPr>
+            <w:r>
+              <w:rPr>
+                <w:sz w:val="19"/>
+              </w:rPr>
+              <w:t>Asesora</w:t>
+            </w:r>
+          </w:p>
+        </w:tc>
+      </w:tr>
+      <w:tr>
+        <w:tc>
+          <w:tcPr>
+            <w:tcW w:type="dxa" w:w="1474"/>
             <w:shd w:val="clear" w:color="auto" w:fill="FFF3E8"/>
           </w:tcPr>
           <w:p>
@@ -270,18 +327,17 @@
             <w:r>
               <w:rPr>
                 <w:b/>
-                <w:sz w:val="21"/>
+                <w:sz w:val="19"/>
               </w:rPr>
-              <w:t>$4.782.800</w:t>
+              <w:t>CAPA 1</w:t>
               <w:br/>
-              <w:t>(45% de beca)</w:t>
+              <w:t>Beneficio de convenio</w:t>
             </w:r>
           </w:p>
         </w:tc>
         <w:tc>
           <w:tcPr>
-            <w:tcW w:type="dxa" w:w="2381"/>
-            <w:shd w:val="clear" w:color="auto" w:fill="FFF3E8"/>
+            <w:tcW w:type="dxa" w:w="2041"/>
           </w:tcPr>
           <w:p>
             <w:pPr>
@@ -289,17 +345,117 @@
             </w:pPr>
             <w:r>
               <w:rPr>
-                <w:sz w:val="21"/>
+                <w:sz w:val="19"/>
               </w:rPr>
-              <w:t>$5.565.440</w:t>
-              <w:br/>
-              <w:t>(36% de beca)</w:t>
+              <w:t>Todos los colaboradores de la empresa aliada, con carta de la empresa</w:t>
             </w:r>
           </w:p>
         </w:tc>
         <w:tc>
           <w:tcPr>
-            <w:tcW w:type="dxa" w:w="4309"/>
+            <w:tcW w:type="dxa" w:w="2608"/>
+          </w:tcPr>
+          <w:p>
+            <w:pPr>
+              <w:spacing w:after="0"/>
+            </w:pPr>
+            <w:r>
+              <w:rPr>
+                <w:sz w:val="19"/>
+              </w:rPr>
+              <w:t>Columna Transformación (igual que Cajasan)</w:t>
+            </w:r>
+          </w:p>
+        </w:tc>
+        <w:tc>
+          <w:tcPr>
+            <w:tcW w:type="dxa" w:w="1531"/>
+          </w:tcPr>
+          <w:p>
+            <w:pPr>
+              <w:spacing w:after="0"/>
+            </w:pPr>
+            <w:r>
+              <w:rPr>
+                <w:sz w:val="19"/>
+              </w:rPr>
+              <w:t>$4.782.800</w:t>
+            </w:r>
+          </w:p>
+        </w:tc>
+        <w:tc>
+          <w:tcPr>
+            <w:tcW w:type="dxa" w:w="1531"/>
+          </w:tcPr>
+          <w:p>
+            <w:pPr>
+              <w:spacing w:after="0"/>
+            </w:pPr>
+            <w:r>
+              <w:rPr>
+                <w:sz w:val="19"/>
+              </w:rPr>
+              <w:t>$5.565.440</w:t>
+            </w:r>
+          </w:p>
+        </w:tc>
+        <w:tc>
+          <w:tcPr>
+            <w:tcW w:type="dxa" w:w="2494"/>
+          </w:tcPr>
+          <w:p>
+            <w:pPr>
+              <w:spacing w:after="0"/>
+            </w:pPr>
+            <w:r>
+              <w:rPr>
+                <w:sz w:val="19"/>
+              </w:rPr>
+              <w:t>Contado: $1.130.480 menos</w:t>
+              <w:br/>
+              <w:t>Cuotas: $869.600 menos</w:t>
+              <w:br/>
+              <w:t>(si ya es de Cajasan: lo mismo que tenía, pero ahora lo usa)</w:t>
+            </w:r>
+          </w:p>
+        </w:tc>
+        <w:tc>
+          <w:tcPr>
+            <w:tcW w:type="dxa" w:w="1871"/>
+          </w:tcPr>
+          <w:p>
+            <w:pPr>
+              <w:spacing w:after="0"/>
+            </w:pPr>
+            <w:r>
+              <w:rPr>
+                <w:sz w:val="19"/>
+              </w:rPr>
+              <w:t>Lo mismo que ya da a Cajasan</w:t>
+            </w:r>
+          </w:p>
+        </w:tc>
+        <w:tc>
+          <w:tcPr>
+            <w:tcW w:type="dxa" w:w="1587"/>
+          </w:tcPr>
+          <w:p>
+            <w:pPr>
+              <w:spacing w:after="0"/>
+            </w:pPr>
+            <w:r>
+              <w:rPr>
+                <w:sz w:val="19"/>
+              </w:rPr>
+              <w:t>Asesora (el empleado llega a la cita como lead caliente)</w:t>
+            </w:r>
+          </w:p>
+        </w:tc>
+      </w:tr>
+      <w:tr>
+        <w:tc>
+          <w:tcPr>
+            <w:tcW w:type="dxa" w:w="1474"/>
             <w:shd w:val="clear" w:color="auto" w:fill="FFF3E8"/>
           </w:tcPr>
           <w:p>
@@ -309,22 +465,19 @@
             <w:r>
               <w:rPr>
                 <w:b/>
-                <w:sz w:val="21"/>
+                <w:sz w:val="19"/>
               </w:rPr>
-              <w:t>$1.130.480 menos de contado</w:t>
+              <w:t>CAPA 2</w:t>
               <w:br/>
-              <w:t>$869.600 menos a cuotas</w:t>
+              <w:t>Beca [Empresa]</w:t>
               <w:br/>
-              <w:br/>
-              <w:t>El mismo trato de un afiliado a Cajasan o de estrato 1-2, con la carta de su jefe como soporte</w:t>
+              <w:t>(3 por ciclo)</w:t>
             </w:r>
           </w:p>
         </w:tc>
-      </w:tr>
-      <w:tr>
         <w:tc>
           <w:tcPr>
-            <w:tcW w:type="dxa" w:w="3685"/>
+            <w:tcW w:type="dxa" w:w="2041"/>
           </w:tcPr>
           <w:p>
             <w:pPr>
@@ -332,17 +485,15 @@
             </w:pPr>
             <w:r>
               <w:rPr>
-                <w:sz w:val="21"/>
+                <w:sz w:val="19"/>
               </w:rPr>
-              <w:t>Los demás empleados de la empresa aliada</w:t>
-              <w:br/>
-              <w:t>(ganan más de 1,5 SMMLV)</w:t>
+              <w:t>Los 3 colaboradores que la empresa premia</w:t>
             </w:r>
           </w:p>
         </w:tc>
         <w:tc>
           <w:tcPr>
-            <w:tcW w:type="dxa" w:w="2268"/>
+            <w:tcW w:type="dxa" w:w="2608"/>
           </w:tcPr>
           <w:p>
             <w:pPr>
@@ -350,35 +501,15 @@
             </w:pPr>
             <w:r>
               <w:rPr>
-                <w:sz w:val="21"/>
+                <w:sz w:val="19"/>
               </w:rPr>
-              <w:t>General, pero a cuotas</w:t>
-              <w:br/>
-              <w:t>con el % de contado</w:t>
+              <w:t>Transformación al 45% AUNQUE PAGUE A CUOTAS + ceremonia con certificado de la empresa + libros + prioridad de cupo</w:t>
             </w:r>
           </w:p>
         </w:tc>
         <w:tc>
           <w:tcPr>
-            <w:tcW w:type="dxa" w:w="2381"/>
-          </w:tcPr>
-          <w:p>
-            <w:pPr>
-              <w:spacing w:after="0"/>
-            </w:pPr>
-            <w:r>
-              <w:rPr>
-                <w:sz w:val="21"/>
-              </w:rPr>
-              <w:t>$5.913.280</w:t>
-              <w:br/>
-              <w:t>(32% de beca)</w:t>
-            </w:r>
-          </w:p>
-        </w:tc>
-        <w:tc>
-          <w:tcPr>
-            <w:tcW w:type="dxa" w:w="2381"/>
+            <w:tcW w:type="dxa" w:w="1531"/>
           </w:tcPr>
           <w:p>
             <w:pPr>
@@ -387,17 +518,15 @@
             <w:r>
               <w:rPr>
                 <w:b/>
-                <w:sz w:val="21"/>
+                <w:sz w:val="19"/>
               </w:rPr>
-              <w:t>$5.913.280</w:t>
-              <w:br/>
-              <w:t>(32% en vez de 26%)</w:t>
+              <w:t>$4.782.800</w:t>
             </w:r>
           </w:p>
         </w:tc>
         <w:tc>
           <w:tcPr>
-            <w:tcW w:type="dxa" w:w="4309"/>
+            <w:tcW w:type="dxa" w:w="1531"/>
           </w:tcPr>
           <w:p>
             <w:pPr>
@@ -406,12 +535,62 @@
             <w:r>
               <w:rPr>
                 <w:b/>
-                <w:sz w:val="21"/>
+                <w:sz w:val="19"/>
               </w:rPr>
-              <w:t>$521.760 menos si paga a cuotas</w:t>
+              <w:t>$4.782.800</w:t>
               <w:br/>
+              <w:t>(en vez de $5.565.440)</w:t>
+            </w:r>
+          </w:p>
+        </w:tc>
+        <w:tc>
+          <w:tcPr>
+            <w:tcW w:type="dxa" w:w="2494"/>
+          </w:tcPr>
+          <w:p>
+            <w:pPr>
+              <w:spacing w:after="0"/>
+            </w:pPr>
+            <w:r>
+              <w:rPr>
+                <w:b/>
+                <w:sz w:val="19"/>
+              </w:rPr>
+              <w:t>Cuotas: $1.652.160 menos que por la calle</w:t>
               <w:br/>
-              <w:t>El mismo beneficio del convenio Cajasan</w:t>
+              <w:t>y $782.640 más que un afiliado a Cajasan</w:t>
+            </w:r>
+          </w:p>
+        </w:tc>
+        <w:tc>
+          <w:tcPr>
+            <w:tcW w:type="dxa" w:w="1871"/>
+          </w:tcPr>
+          <w:p>
+            <w:pPr>
+              <w:spacing w:after="0"/>
+            </w:pPr>
+            <w:r>
+              <w:rPr>
+                <w:sz w:val="19"/>
+              </w:rPr>
+              <w:t>$782.640 por premiado que pague a cuotas · tope 3 por empresa, 15 en el piloto</w:t>
+            </w:r>
+          </w:p>
+        </w:tc>
+        <w:tc>
+          <w:tcPr>
+            <w:tcW w:type="dxa" w:w="1587"/>
+          </w:tcPr>
+          <w:p>
+            <w:pPr>
+              <w:spacing w:after="0"/>
+            </w:pPr>
+            <w:r>
+              <w:rPr>
+                <w:sz w:val="19"/>
+              </w:rPr>
+              <w:t>Asesora; el convenio lo cierra el docente</w:t>
             </w:r>
           </w:p>
         </w:tc>
@@ -419,7 +598,8 @@
       <w:tr>
         <w:tc>
           <w:tcPr>
-            <w:tcW w:type="dxa" w:w="3685"/>
+            <w:tcW w:type="dxa" w:w="1474"/>
+            <w:shd w:val="clear" w:color="auto" w:fill="FFF3E8"/>
           </w:tcPr>
           <w:p>
             <w:pPr>
@@ -427,7 +607,26 @@
             </w:pPr>
             <w:r>
               <w:rPr>
-                <w:sz w:val="21"/>
+                <w:b/>
+                <w:sz w:val="19"/>
+              </w:rPr>
+              <w:t>CAPA 3</w:t>
+              <w:br/>
+              <w:t>Beneficios de la empresa</w:t>
+            </w:r>
+          </w:p>
+        </w:tc>
+        <w:tc>
+          <w:tcPr>
+            <w:tcW w:type="dxa" w:w="2041"/>
+          </w:tcPr>
+          <w:p>
+            <w:pPr>
+              <w:spacing w:after="0"/>
+            </w:pPr>
+            <w:r>
+              <w:rPr>
+                <w:sz w:val="19"/>
               </w:rPr>
               <w:t>La empresa aliada</w:t>
             </w:r>
@@ -435,7 +634,7 @@
         </w:tc>
         <w:tc>
           <w:tcPr>
-            <w:tcW w:type="dxa" w:w="2268"/>
+            <w:tcW w:type="dxa" w:w="2608"/>
           </w:tcPr>
           <w:p>
             <w:pPr>
@@ -443,15 +642,15 @@
             </w:pPr>
             <w:r>
               <w:rPr>
-                <w:sz w:val="21"/>
+                <w:sz w:val="19"/>
               </w:rPr>
-              <w:t>—</w:t>
+              <w:t>Ceremonia con su nombre · reporte de avance de sus becados · diagnóstico de inglés para su equipo (10 personas) · vitrina de egresados</w:t>
             </w:r>
           </w:p>
         </w:tc>
         <w:tc>
           <w:tcPr>
-            <w:tcW w:type="dxa" w:w="2381"/>
+            <w:tcW w:type="dxa" w:w="1531"/>
           </w:tcPr>
           <w:p>
             <w:pPr>
@@ -459,15 +658,15 @@
             </w:pPr>
             <w:r>
               <w:rPr>
-                <w:sz w:val="21"/>
+                <w:sz w:val="19"/>
               </w:rPr>
-              <w:t>—</w:t>
+              <w:t>$0</w:t>
             </w:r>
           </w:p>
         </w:tc>
         <w:tc>
           <w:tcPr>
-            <w:tcW w:type="dxa" w:w="2381"/>
+            <w:tcW w:type="dxa" w:w="1531"/>
           </w:tcPr>
           <w:p>
             <w:pPr>
@@ -475,15 +674,15 @@
             </w:pPr>
             <w:r>
               <w:rPr>
-                <w:sz w:val="21"/>
+                <w:sz w:val="19"/>
               </w:rPr>
-              <w:t>—</w:t>
+              <w:t>$0</w:t>
             </w:r>
           </w:p>
         </w:tc>
         <w:tc>
           <w:tcPr>
-            <w:tcW w:type="dxa" w:w="4309"/>
+            <w:tcW w:type="dxa" w:w="2494"/>
           </w:tcPr>
           <w:p>
             <w:pPr>
@@ -491,11 +690,182 @@
             </w:pPr>
             <w:r>
               <w:rPr>
-                <w:sz w:val="21"/>
+                <w:sz w:val="19"/>
               </w:rPr>
-              <w:t>Paga $0.</w:t>
+              <w:t>Nada de esto lo da una caja</w:t>
+            </w:r>
+          </w:p>
+        </w:tc>
+        <w:tc>
+          <w:tcPr>
+            <w:tcW w:type="dxa" w:w="1871"/>
+          </w:tcPr>
+          <w:p>
+            <w:pPr>
+              <w:spacing w:after="0"/>
+            </w:pPr>
+            <w:r>
+              <w:rPr>
+                <w:sz w:val="19"/>
+              </w:rPr>
+              <w:t>Horas del equipo</w:t>
+            </w:r>
+          </w:p>
+        </w:tc>
+        <w:tc>
+          <w:tcPr>
+            <w:tcW w:type="dxa" w:w="1587"/>
+          </w:tcPr>
+          <w:p>
+            <w:pPr>
+              <w:spacing w:after="0"/>
+            </w:pPr>
+            <w:r>
+              <w:rPr>
+                <w:sz w:val="19"/>
+              </w:rPr>
+              <w:t>Docente (convenio estándar)</w:t>
+            </w:r>
+          </w:p>
+        </w:tc>
+      </w:tr>
+      <w:tr>
+        <w:tc>
+          <w:tcPr>
+            <w:tcW w:type="dxa" w:w="1474"/>
+            <w:shd w:val="clear" w:color="auto" w:fill="FFF3E8"/>
+          </w:tcPr>
+          <w:p>
+            <w:pPr>
+              <w:spacing w:after="0"/>
+            </w:pPr>
+            <w:r>
+              <w:rPr>
+                <w:b/>
+                <w:sz w:val="19"/>
+              </w:rPr>
+              <w:t>CAPA 4</w:t>
               <w:br/>
-              <w:t>Recibe: ceremonia de becas con su nombre, reporte de avance de sus becados y diagnóstico de inglés para su equipo</w:t>
+              <w:t>Tarifa corporativa</w:t>
+              <w:br/>
+              <w:t>(la empresa paga)</w:t>
+            </w:r>
+          </w:p>
+        </w:tc>
+        <w:tc>
+          <w:tcPr>
+            <w:tcW w:type="dxa" w:w="2041"/>
+          </w:tcPr>
+          <w:p>
+            <w:pPr>
+              <w:spacing w:after="0"/>
+            </w:pPr>
+            <w:r>
+              <w:rPr>
+                <w:sz w:val="19"/>
+              </w:rPr>
+              <w:t>La empresa compra cupos para sus colaboradores, mínimo 3</w:t>
+            </w:r>
+          </w:p>
+        </w:tc>
+        <w:tc>
+          <w:tcPr>
+            <w:tcW w:type="dxa" w:w="2608"/>
+          </w:tcPr>
+          <w:p>
+            <w:pPr>
+              <w:spacing w:after="0"/>
+            </w:pPr>
+            <w:r>
+              <w:rPr>
+                <w:sz w:val="19"/>
+              </w:rPr>
+              <w:t>Programa completo por cupo a tarifa corporativa (mismo valor que la Transformación de contado), factura a la empresa, copago posible</w:t>
+            </w:r>
+          </w:p>
+        </w:tc>
+        <w:tc>
+          <w:tcPr>
+            <w:tcW w:type="dxa" w:w="1531"/>
+          </w:tcPr>
+          <w:p>
+            <w:pPr>
+              <w:spacing w:after="0"/>
+            </w:pPr>
+            <w:r>
+              <w:rPr>
+                <w:b/>
+                <w:sz w:val="19"/>
+              </w:rPr>
+              <w:t>$4.782.800 por cupo</w:t>
+              <w:br/>
+              <w:t>(3 cupos: $14.348.400)</w:t>
+            </w:r>
+          </w:p>
+        </w:tc>
+        <w:tc>
+          <w:tcPr>
+            <w:tcW w:type="dxa" w:w="1531"/>
+          </w:tcPr>
+          <w:p>
+            <w:pPr>
+              <w:spacing w:after="0"/>
+            </w:pPr>
+            <w:r>
+              <w:rPr>
+                <w:b/>
+                <w:sz w:val="19"/>
+              </w:rPr>
+              <w:t>Cuotas corporativas que pacta gerencia</w:t>
+            </w:r>
+          </w:p>
+        </w:tc>
+        <w:tc>
+          <w:tcPr>
+            <w:tcW w:type="dxa" w:w="2494"/>
+          </w:tcPr>
+          <w:p>
+            <w:pPr>
+              <w:spacing w:after="0"/>
+            </w:pPr>
+            <w:r>
+              <w:rPr>
+                <w:b/>
+                <w:sz w:val="19"/>
+              </w:rPr>
+              <w:t>El colaborador no paga nada o paga solo una parte</w:t>
+            </w:r>
+          </w:p>
+        </w:tc>
+        <w:tc>
+          <w:tcPr>
+            <w:tcW w:type="dxa" w:w="1871"/>
+          </w:tcPr>
+          <w:p>
+            <w:pPr>
+              <w:spacing w:after="0"/>
+            </w:pPr>
+            <w:r>
+              <w:rPr>
+                <w:sz w:val="19"/>
+              </w:rPr>
+              <w:t>Nada: es venta a precio Transformación, con plata por adelantado</w:t>
+            </w:r>
+          </w:p>
+        </w:tc>
+        <w:tc>
+          <w:tcPr>
+            <w:tcW w:type="dxa" w:w="1587"/>
+          </w:tcPr>
+          <w:p>
+            <w:pPr>
+              <w:spacing w:after="0"/>
+            </w:pPr>
+            <w:r>
+              <w:rPr>
+                <w:sz w:val="19"/>
+              </w:rPr>
+              <w:t>GERENCIA (el docente agenda, 3%)</w:t>
             </w:r>
           </w:p>
         </w:tc>
@@ -506,14 +876,32 @@
       <w:r>
         <w:rPr>
           <w:color w:val="777777"/>
-          <w:sz w:val="19"/>
+          <w:sz w:val="18"/>
         </w:rPr>
-        <w:t>Regla del mejor beneficio: nunca se suman dos becas; se aplica la mayor a la que el colaborador califique. Cupo: la Beca Transformación tiene un tope del 30% de las matrículas nuevas por trimestre; los becados por empresa entran en ese cupo.</w:t>
+        <w:t>• Regla del mejor beneficio: nunca se suman dos becas; se aplica la mayor a la que el colaborador califique. El afiliado a Cajasan y el colaborador de empresa aliada reciben lo mismo en la capa 1; la capa 2 es lo que solo da la empresa.</w:t>
+      </w:r>
+    </w:p>
+    <w:p>
+      <w:r>
+        <w:rPr>
+          <w:color w:val="777777"/>
+          <w:sz w:val="18"/>
+        </w:rPr>
+        <w:t>• Cupo: la columna Transformación tiene tope del 30% de las matrículas nuevas por trimestre; capas 1 y 2 entran en ese cupo. La capa 4 no pasa por el Fondo: es tarifa corporativa por volumen.</w:t>
+      </w:r>
+    </w:p>
+    <w:p>
+      <w:r>
+        <w:rPr>
+          <w:color w:val="777777"/>
+          <w:sz w:val="18"/>
+        </w:rPr>
+        <w:t>• Cambios que esto exige: reglamento del Fondo art. 3.1 d (de "cliente empresarial tarifa plena" a "tarifa corporativa por volumen") y art. 3.5 (empresa aliada = Transformación para todos + Beca [Empresa] 45% a cuotas, 3 por ciclo); convenio, propuesta del docente y kit.</w:t>
       </w:r>
     </w:p>
     <w:sectPr>
       <w:pgSz w:w="15840" w:h="12240" w:orient="landscape"/>
-      <w:pgMar w:top="850" w:right="850" w:bottom="680" w:left="850" w:header="720" w:footer="720" w:gutter="0"/>
+      <w:pgMar w:top="680" w:right="737" w:bottom="567" w:left="737" w:header="720" w:footer="720" w:gutter="0"/>
       <w:cols w:space="720"/>
       <w:docGrid w:linePitch="360"/>
     </w:sectPr>
@@ -886,7 +1274,7 @@
     <w:rsid w:val="00FC693F"/>
     <w:rPr>
       <w:rFonts w:ascii="Calibri" w:hAnsi="Calibri"/>
-      <w:sz w:val="22"/>
+      <w:sz w:val="21"/>
     </w:rPr>
   </w:style>
   <w:style w:type="paragraph" w:styleId="Header">

</xml_diff>

<commit_message>
B2B: 'ciclo' definido como TRIMESTRE calendario (3 Becas Empresa por empresa y trimestre; +2 el siguiente si cumplen; no se acumulan)
</commit_message>
<xml_diff>
--- a/recursos/comercial/B2B/COMPARATIVO_BENEFICIO_ALIANZA.docx
+++ b/recursos/comercial/B2B/COMPARATIVO_BENEFICIO_ALIANZA.docx
@@ -469,7 +469,7 @@
               <w:br/>
               <w:t>Beca [Empresa]</w:t>
               <w:br/>
-              <w:t>(3 por ciclo)</w:t>
+              <w:t>(3 por trimestre)</w:t>
             </w:r>
           </w:p>
         </w:tc>
@@ -501,7 +501,7 @@
               <w:rPr>
                 <w:sz w:val="19"/>
               </w:rPr>
-              <w:t>45% aunque paguen a cuotas + libros + prioridad de cupo + certificado a nombre de la empresa. Si los 3 cumplen, +2 el ciclo siguiente</w:t>
+              <w:t>45% aunque paguen a cuotas + libros + prioridad de cupo + certificado a nombre de la empresa. Si los 3 cumplen, +2 el trimestre siguiente</w:t>
             </w:r>
           </w:p>
         </w:tc>

</xml_diff>